<commit_message>
Implement the three SPO value tables and warm start them from history, sync doc section 3.4
</commit_message>
<xml_diff>
--- a/docx/胡宏彬-进度文档-20260818.docx
+++ b/docx/胡宏彬-进度文档-20260818.docx
@@ -4500,6 +4500,50 @@
           <w:rFonts w:hint="eastAsia"/>
         </w:rPr>
         <w:t xml:space="preserve">其中 A_shield(s) 是屏蔽后的可行动作集，由定理 2 保证非空。收到 CDS 的奖励后按增量式更新 Q(j, a)。当同一窗口内发生撤销时，把撤销原因并入上下文，使被结构条件否决与被效用条件否决对应不同的备选分布，这正是固定规则版本所缺少的部分。</w:t>
+      </w:r>
+    </w:p>
+    <w:p>
+      <w:pPr>
+        <w:ind w:firstLineChars="200" w:firstLine="420"/>
+      </w:pPr>
+      <w:r>
+        <w:rPr>
+          <w:rFonts w:hint="eastAsia"/>
+        </w:rPr>
+        <w:t>价值表按撤销原因分为三张而非一张。Q0 用于窗口内的首次提议，Q_struct 用于被结构条件否决后的重试，Q_util 用于被效用条件否决后的重试。分开维护而不是在单张表上加一维特征，理由是两类否决指向不同的备选方向。结构否决意味着足迹过大，后续应换足迹更小的算子。效用否决意味着缺陷判断本身可能有误，后续应重新考虑窗口中存在的是哪一类缺陷。单张表会把这两种方向平均成一个次序，而这正是固定规则版本表现出的失效方式。每张表按 k 乘以算子数建全表，k 取 12 时为 12 乘 4。</w:t>
+      </w:r>
+    </w:p>
+    <w:p>
+      <w:pPr>
+        <w:ind w:firstLineChars="200" w:firstLine="420"/>
+      </w:pPr>
+      <w:r>
+        <w:rPr>
+          <w:rFonts w:hint="eastAsia"/>
+        </w:rPr>
+        <w:t>暖启动用固定规则策略的历史轨迹填充。每个格子的初值取该格子历史上实际获得的屏蔽奖励的均值，访问计数取历史样本数与上限的较小者。被撤销的候选按其探测代价计入负奖励，因此一个历来无一通过的格子初值低于零，策略据此有理由优先尝试未访问过的格子。RESEGMENT 一列不按簇分别填充，而是整列取其全局均值，依据是阶段零的实测结果显示该算子的接受率在簇之间没有差异，四个 k 下的置换检验 p 值均在 0.81 与 0.96 之间，按簇填充等于把抽样噪声写成先验。历史从未访问过的格子取乐观初值以促使在线探索，k 为 12 时 Q0 表有 11 个、Q_struct 表有 16 个、Q_util 表有 20 个这样的格子。</w:t>
+      </w:r>
+    </w:p>
+    <w:p>
+      <w:pPr>
+        <w:ind w:firstLineChars="200" w:firstLine="420"/>
+      </w:pPr>
+      <w:r>
+        <w:rPr>
+          <w:rFonts w:hint="eastAsia"/>
+        </w:rPr>
+        <w:t>样本量过小的画像簇合并处理。k 为 12 时簇 9 只含 1 个窗口、簇 10 只含 3 个窗口，由它们估计的价值不构成估计，因此各自并入按质心余弦相似度最近的规模达标簇，实测分别并入簇 6 与簇 7，余弦相似度为 0.789 与 0.946。规模下限取 5 个窗口。</w:t>
+      </w:r>
+    </w:p>
+    <w:p>
+      <w:pPr>
+        <w:ind w:firstLineChars="200" w:firstLine="420"/>
+      </w:pPr>
+      <w:r>
+        <w:rPr>
+          <w:rFonts w:hint="eastAsia"/>
+        </w:rPr>
+        <w:t>接受奖励需要设上界。定理 5 的遗憾界要求奖励有界或次高斯，而实测的效用变化两者皆非，其中位数为 0.202 而 99 分位数达 54.9，404 次接受中有 6 次超过 50，远高于上置信界在同等规模下约 0.87 的探索宽度。若不设上界，持有极端值的格子将被永久选中而探索停止，这破坏的是定理的前提而非结论。因此接受奖励按训练划分上的 95 分位数截断，实测该值为 5.89，评测划分不参与该数值的确定。截断为单侧，撤销奖励本身已由代价系数限定。</w:t>
       </w:r>
     </w:p>
     <w:p>

</xml_diff>

<commit_message>
Sync doc section 6.1 with the three stage zero findings
</commit_message>
<xml_diff>
--- a/docx/胡宏彬-进度文档-20260818.docx
+++ b/docx/胡宏彬-进度文档-20260818.docx
@@ -7401,6 +7401,63 @@
           <w:rFonts w:hint="eastAsia"/>
         </w:rPr>
         <w:t xml:space="preserve">校准集与部署数据的可交换性不成立，属实验设计问题。改为同一池的随机划分后保证恢复，该问题在引入策略学习后需要通过定期重新标定来控制。</w:t>
+      </w:r>
+    </w:p>
+    <w:p>
+      <w:pPr>
+        <w:pStyle w:val="aff5"/>
+        <w:numPr>
+          <w:ilvl w:val="0"/>
+          <w:numId w:val="7"/>
+        </w:numPr>
+        <w:spacing w:after="0" w:line="240" w:lineRule="auto"/>
+        <w:ind w:firstLineChars="0" w:firstLine="0"/>
+      </w:pPr>
+      <w:r>
+        <w:rPr>
+          <w:rFonts w:hint="eastAsia"/>
+          <w:b/>
+          <w:bCs/>
+        </w:rPr>
+        <w:t>可学结构集中在单一算子上。阶段零按画像簇与算子交叉统计固定规则策略的接受率，1561 次经屏蔽裁决的候选中，IMPUTE 占 1215 次，其接受率在簇之间的差异在四个 k 下的置换检验中均显著，k 为 12 时 p 为 0.0043。RESEGMENT 在任何 k 下都不显著，p 介于 0.81 与 0.96 之间，说明该算子的接受与否不依赖窗口类型。DESPIKE 随簇数增大迅速失去显著性，从 0.0202 升至 0.2226，更像分辨率不足而非结构。DENOISE 仅 71 次候选且低期望频数格子过多，不作为独立证据。这意味着策略学习的收益主要来自对 IMPUTE 提议的取舍，而非全部算子。</w:t>
+      </w:r>
+    </w:p>
+    <w:p>
+      <w:pPr>
+        <w:pStyle w:val="aff5"/>
+        <w:numPr>
+          <w:ilvl w:val="0"/>
+          <w:numId w:val="7"/>
+        </w:numPr>
+        <w:spacing w:after="0" w:line="240" w:lineRule="auto"/>
+        <w:ind w:firstLineChars="0" w:firstLine="0"/>
+      </w:pPr>
+      <w:r>
+        <w:rPr>
+          <w:rFonts w:hint="eastAsia"/>
+          <w:b/>
+          <w:bCs/>
+        </w:rPr>
+        <w:t>固定规则策略存在系统性盲区。k 为 12 时 48 个簇与算子组合中有 12 个从未被访问，其中簇 1 与簇 11 的 DENOISE 两格合计覆盖 392 个窗口，占语料近两成，而固定规则在这些窗口上一次也没有提议过 DENOISE。这不是数据稀疏而是确定性策略的结构性缺失，离线无法对这些格子估值，只能依靠在线探索填补，这也是引入乐观初始化的直接理由。</w:t>
+      </w:r>
+    </w:p>
+    <w:p>
+      <w:pPr>
+        <w:pStyle w:val="aff5"/>
+        <w:numPr>
+          <w:ilvl w:val="0"/>
+          <w:numId w:val="7"/>
+        </w:numPr>
+        <w:spacing w:after="0" w:line="240" w:lineRule="auto"/>
+        <w:ind w:firstLineChars="0" w:firstLine="0"/>
+      </w:pPr>
+      <w:r>
+        <w:rPr>
+          <w:rFonts w:hint="eastAsia"/>
+          <w:b/>
+          <w:bCs/>
+        </w:rPr>
+        <w:t>画像簇不是分层标签的重述。簇与分层标签的调整互信息在四个 k 下介于 0.1384 与 0.1502 之间，数值很低。若两者高度一致，则接受率随簇变化这一现象将只是接受率随分层变化的换一种说法，而分层信息 CDP 已经以缺陷假设的形式给出，策略学习不会带来新信息。实测结果排除了这一可能。</w:t>
       </w:r>
     </w:p>
     <w:p>

</xml_diff>

<commit_message>
Sweep the reward clip percentile and add a code hash assertion, sync doc section 3.4 theorem 5 assumption
</commit_message>
<xml_diff>
--- a/docx/胡宏彬-进度文档-20260818.docx
+++ b/docx/胡宏彬-进度文档-20260818.docx
@@ -4532,6 +4532,17 @@
         <w:rPr>
           <w:rFonts w:hint="eastAsia"/>
         </w:rPr>
+        <w:t>以历史屏蔽奖励均值作为初值还带来一个有用的性质，它使暖启动同时编码了负面证据。被撤销的候选按探测代价计入负奖励，因此一个历来无一通过的格子初值低于零，而未被访问过的格子取乐观初值高于零，策略据此自然地优先尝试未访问格而回避已知无效格，不需要为回避已知无效格另设机制。这是采用奖励均值而非接受率乘平均效用增益的理由之一，后者在无一通过时得到零，无法区分从未有效与从未尝试。</w:t>
+      </w:r>
+    </w:p>
+    <w:p>
+      <w:pPr>
+        <w:ind w:firstLineChars="200" w:firstLine="420"/>
+      </w:pPr>
+      <w:r>
+        <w:rPr>
+          <w:rFonts w:hint="eastAsia"/>
+        </w:rPr>
         <w:t>样本量过小的画像簇合并处理。k 为 12 时簇 9 只含 1 个窗口、簇 10 只含 3 个窗口，由它们估计的价值不构成估计，因此各自并入按质心余弦相似度最近的规模达标簇，实测分别并入簇 6 与簇 7，余弦相似度为 0.789 与 0.946。规模下限取 5 个窗口。</w:t>
       </w:r>
     </w:p>
@@ -4544,6 +4555,17 @@
           <w:rFonts w:hint="eastAsia"/>
         </w:rPr>
         <w:t>接受奖励需要设上界。定理 5 的遗憾界要求奖励有界或次高斯，而实测的效用变化两者皆非，其中位数为 0.202 而 99 分位数达 54.9，404 次接受中有 6 次超过 50，远高于上置信界在同等规模下约 0.87 的探索宽度。若不设上界，持有极端值的格子将被永久选中而探索停止，这破坏的是定理的前提而非结论。因此接受奖励按训练划分上的 95 分位数截断，实测该值为 5.89，评测划分不参与该数值的确定。截断为单侧，撤销奖励本身已由代价系数限定。</w:t>
+      </w:r>
+    </w:p>
+    <w:p>
+      <w:pPr>
+        <w:ind w:firstLineChars="200" w:firstLine="420"/>
+      </w:pPr>
+      <w:r>
+        <w:rPr>
+          <w:rFonts w:hint="eastAsia"/>
+        </w:rPr>
+        <w:t>截断分位数的取值经过敏感性检验。95 分位这一取值是在观察奖励分布之后确定的，因此需要检验结论是否依赖它。取 90 与 95 与 99 三档重建价值表并比较策略行为，三档对应的截断值分别为 1.70 与 5.89 与 58.74，被截断的接受候选分别为 404 次中的 32 次与 17 次与 3 次。以上置信界在同一语料上选出的动作衡量，三档两两之间选中同一动作的窗口比例为 0.8785 至 0.9860，价值表全序的肯德尔相关系数为 0.8796 至 0.9759，其中 95 与 99 两档的一致比例达 0.9860。结论不依赖该取值。需要说明的是 90 分位与另两档的差距略大，约一成窗口选中不同动作，原因是该档把 32 次接受压到 1.70，压缩幅度已经影响到分布主体而非仅尾部。</w:t>
       </w:r>
     </w:p>
     <w:p>
@@ -4969,13 +4991,7 @@
           <w:b/>
           <w:bCs/>
         </w:rPr>
-        <w:t xml:space="preserve">定理 5（屏蔽动作空间上的遗憾界）</w:t>
-      </w:r>
-      <w:r>
-        <w:rPr>
-          <w:rFonts w:hint="eastAsia"/>
-        </w:rPr>
-        <w:t xml:space="preserve"> 设奖励关于状态特征线性可表示，屏蔽后的动作集 A_shield(s) 在每个状态下非空，则算法 3 采用的上置信界策略相对于最优屏蔽策略的累积遗憾为 O( sqrt( T d log T ) )，其中 T 为总决策轮数，d 为状态特征维度。</w:t>
+        <w:t>定理 5（屏蔽动作空间上的遗憾界） 设奖励关于状态特征线性可表示且取值有界，屏蔽后的动作集 A_shield(s) 在每个状态下非空，则算法 3 采用的上置信界策略相对于最优屏蔽策略的累积遗憾为 O( sqrt( T d log T ) )，其中 T 为总决策轮数，d 为状态特征维度。</w:t>
       </w:r>
     </w:p>
     <w:p>
@@ -5000,6 +5016,17 @@
           <w:rFonts w:hint="eastAsia"/>
         </w:rPr>
         <w:t xml:space="preserve">，其遗憾界形式与动作集大小无关，只依赖特征维度与轮数。将比较基准取为屏蔽后可行动作中的最优策略，即得结论。证毕。</w:t>
+      </w:r>
+    </w:p>
+    <w:p>
+      <w:pPr>
+        <w:ind w:firstLineChars="200" w:firstLine="420"/>
+      </w:pPr>
+      <w:r>
+        <w:rPr>
+          <w:rFonts w:hint="eastAsia"/>
+        </w:rPr>
+        <w:t>有界性这一假设在实现中由奖励截断保证。实测的效用变化呈长尾分布，其 99 分位数与中位数相差两个数量级，若不加处理则该假设不成立，遗憾界的推导前提随之失效。因此实现对接受奖励按训练划分的分位数做单侧截断，使实现与定理严格对应，而非为调节效果所做的取舍。</w:t>
       </w:r>
     </w:p>
     <w:p>

</xml_diff>

<commit_message>
Measure MTCSC against SCREEN at three levels and keep it as a separate row, sync doc section 4.1.3
</commit_message>
<xml_diff>
--- a/docx/胡宏彬-进度文档-20260818.docx
+++ b/docx/胡宏彬-进度文档-20260818.docx
@@ -6047,6 +6047,28 @@
           <w:rFonts w:hint="eastAsia"/>
         </w:rPr>
         <w:t xml:space="preserve"> 的单变量分支代表 2024 年的工作。这一族在本文中同时承担两个角色，既作为独立方法参与对比，也作为提议者接入本文的屏蔽层，用以检验屏蔽与策略是否与具体的动作来源解耦。</w:t>
+      </w:r>
+    </w:p>
+    <w:p>
+      <w:pPr>
+        <w:ind w:firstLineChars="200" w:firstLine="420"/>
+      </w:pPr>
+      <w:r>
+        <w:rPr>
+          <w:rFonts w:hint="eastAsia"/>
+        </w:rPr>
+        <w:t>关于 MTCSC 是否单列的实测判定。该方法与 SCREEN 同属速度约束修复，因此在实现之前先在本文语料上实测二者的编辑重合度，判据与结论均在测量前写定，若高度重合则不单列并注明重合，若不重合则单列。测量在 2000 个窗口上分三个层次进行，二者取相同的速度约束以保证差异只来自修复规则。窗口层次上二者编辑了完全相同的 823 个窗口，杰卡德系数为 1.0000，六个分层无一例外。点层次上二者改动位置的杰卡德系数为 0.7021，逐窗口均值为 0.8013。值层次上，在二者都改动的 17790 个位置中，修复到相同数值的仅 67 个即 0.0038，两种修复的差距以窗口自身干净序列标准差为单位计，中位数为 0.4450 倍标准差，四分之三分位数为 0.8507 倍，仅有百分之十三点五七的位置差距小于 0.1 倍标准差。</w:t>
+      </w:r>
+    </w:p>
+    <w:p>
+      <w:pPr>
+        <w:ind w:firstLineChars="200" w:firstLine="420"/>
+      </w:pPr>
+      <w:r>
+        <w:rPr>
+          <w:rFonts w:hint="eastAsia"/>
+        </w:rPr>
+        <w:t>据此判定 MTCSC 单变量分支在全基线表中单独列出。三个层次给出方向相反的答案，若只测窗口层次会得到完全重合的结论，而实际情况是二者定位相同的问题却给出实质不同的修复，中位差距接近半个标准差，落在下游指标上必然产生不同的损害与修复读数。合并将掩盖这一差异。此判定的依据是重合程度的实测结果而非实现工时，测量脚本与逐层数据见 experiments/mtcsc_overlap.py 与 results/mtcsc_overlap.json。</w:t>
       </w:r>
     </w:p>
     <w:p>

</xml_diff>